<commit_message>
Add section-aware notes panel for discussion capture
</commit_message>
<xml_diff>
--- a/AISec-source.docx
+++ b/AISec-source.docx
@@ -20900,15 +20900,25 @@
 </file>
 
 <file path=customXml/item1.xml><?xml version="1.0" encoding="utf-8"?>
-<?mso-contentType ?>
-<FormTemplates xmlns="http://schemas.microsoft.com/sharepoint/v3/contenttype/forms">
-  <Display>DocumentLibraryForm</Display>
-  <Edit>DocumentLibraryForm</Edit>
-  <New>DocumentLibraryForm</New>
-</FormTemplates>
+<b:Sources xmlns:b="http://schemas.openxmlformats.org/officeDocument/2006/bibliography" xmlns="http://schemas.openxmlformats.org/officeDocument/2006/bibliography" SelectedStyle="\APASixthEditionOfficeOnline.xsl" StyleName="APA" Version="6"/>
 </file>
 
 <file path=customXml/item2.xml><?xml version="1.0" encoding="utf-8"?>
+<p:properties xmlns:p="http://schemas.microsoft.com/office/2006/metadata/properties" xmlns:xsi="http://www.w3.org/2001/XMLSchema-instance" xmlns:pc="http://schemas.microsoft.com/office/infopath/2007/PartnerControls">
+  <documentManagement>
+    <lcf76f155ced4ddcb4097134ff3c332f xmlns="e65a9030-60ec-4a14-8955-2b18543e766f">
+      <Terms xmlns="http://schemas.microsoft.com/office/infopath/2007/PartnerControls"/>
+    </lcf76f155ced4ddcb4097134ff3c332f>
+    <_ip_UnifiedCompliancePolicyUIAction xmlns="http://schemas.microsoft.com/sharepoint/v3" xsi:nil="true"/>
+    <_ip_UnifiedCompliancePolicyProperties xmlns="http://schemas.microsoft.com/sharepoint/v3" xsi:nil="true"/>
+    <TaxCatchAll xmlns="de6b8331-2e8c-467d-b117-fec27c45c6dd" xsi:nil="true"/>
+    <TranslatedLang xmlns="e65a9030-60ec-4a14-8955-2b18543e766f" xsi:nil="true"/>
+    <IPStatus xmlns="de6b8331-2e8c-467d-b117-fec27c45c6dd">Draft - Ready for Review</IPStatus>
+  </documentManagement>
+</p:properties>
+</file>
+
+<file path=customXml/item3.xml><?xml version="1.0" encoding="utf-8"?>
 <ct:contentTypeSchema xmlns:ct="http://schemas.microsoft.com/office/2006/metadata/contentType" xmlns:ma="http://schemas.microsoft.com/office/2006/metadata/properties/metaAttributes" ct:_="" ma:_="" ma:contentTypeName="Document" ma:contentTypeID="0x0101004268DD3AEB218C4E878BD813D1CB2393" ma:contentTypeVersion="17" ma:contentTypeDescription="Create a new document." ma:contentTypeScope="" ma:versionID="c120ad735626379b30dac7a9b26f8cac">
   <xsd:schema xmlns:xsd="http://www.w3.org/2001/XMLSchema" xmlns:xs="http://www.w3.org/2001/XMLSchema" xmlns:p="http://schemas.microsoft.com/office/2006/metadata/properties" xmlns:ns1="http://schemas.microsoft.com/sharepoint/v3" xmlns:ns2="e65a9030-60ec-4a14-8955-2b18543e766f" xmlns:ns3="de6b8331-2e8c-467d-b117-fec27c45c6dd" targetNamespace="http://schemas.microsoft.com/office/2006/metadata/properties" ma:root="true" ma:fieldsID="f6605457bf1ee6f94eed00f5fe27ed82" ns1:_="" ns2:_="" ns3:_="">
     <xsd:import namespace="http://schemas.microsoft.com/sharepoint/v3"/>
@@ -21155,34 +21165,36 @@
 </ct:contentTypeSchema>
 </file>
 
-<file path=customXml/item3.xml><?xml version="1.0" encoding="utf-8"?>
-<p:properties xmlns:p="http://schemas.microsoft.com/office/2006/metadata/properties" xmlns:xsi="http://www.w3.org/2001/XMLSchema-instance" xmlns:pc="http://schemas.microsoft.com/office/infopath/2007/PartnerControls">
-  <documentManagement>
-    <lcf76f155ced4ddcb4097134ff3c332f xmlns="e65a9030-60ec-4a14-8955-2b18543e766f">
-      <Terms xmlns="http://schemas.microsoft.com/office/infopath/2007/PartnerControls"/>
-    </lcf76f155ced4ddcb4097134ff3c332f>
-    <_ip_UnifiedCompliancePolicyUIAction xmlns="http://schemas.microsoft.com/sharepoint/v3" xsi:nil="true"/>
-    <_ip_UnifiedCompliancePolicyProperties xmlns="http://schemas.microsoft.com/sharepoint/v3" xsi:nil="true"/>
-    <TaxCatchAll xmlns="de6b8331-2e8c-467d-b117-fec27c45c6dd" xsi:nil="true"/>
-    <TranslatedLang xmlns="e65a9030-60ec-4a14-8955-2b18543e766f" xsi:nil="true"/>
-    <IPStatus xmlns="de6b8331-2e8c-467d-b117-fec27c45c6dd">Draft - Ready for Review</IPStatus>
-  </documentManagement>
-</p:properties>
-</file>
-
 <file path=customXml/item4.xml><?xml version="1.0" encoding="utf-8"?>
-<b:Sources xmlns:b="http://schemas.openxmlformats.org/officeDocument/2006/bibliography" xmlns="http://schemas.openxmlformats.org/officeDocument/2006/bibliography" SelectedStyle="\APASixthEditionOfficeOnline.xsl" StyleName="APA" Version="6"/>
+<?mso-contentType ?>
+<FormTemplates xmlns="http://schemas.microsoft.com/sharepoint/v3/contenttype/forms">
+  <Display>DocumentLibraryForm</Display>
+  <Edit>DocumentLibraryForm</Edit>
+  <New>DocumentLibraryForm</New>
+</FormTemplates>
 </file>
 
 <file path=customXml/itemProps1.xml><?xml version="1.0" encoding="utf-8"?>
-<ds:datastoreItem xmlns:ds="http://schemas.openxmlformats.org/officeDocument/2006/customXml" ds:itemID="{2339508A-8A67-41CC-9A24-2CA767772708}">
+<ds:datastoreItem xmlns:ds="http://schemas.openxmlformats.org/officeDocument/2006/customXml" ds:itemID="{862140F3-E3E9-4737-B9D8-A6A75D17B8A0}">
   <ds:schemaRefs>
-    <ds:schemaRef ds:uri="http://schemas.microsoft.com/sharepoint/v3/contenttype/forms"/>
+    <ds:schemaRef ds:uri="http://schemas.openxmlformats.org/officeDocument/2006/bibliography"/>
   </ds:schemaRefs>
 </ds:datastoreItem>
 </file>
 
 <file path=customXml/itemProps2.xml><?xml version="1.0" encoding="utf-8"?>
+<ds:datastoreItem xmlns:ds="http://schemas.openxmlformats.org/officeDocument/2006/customXml" ds:itemID="{AD5BE390-E20C-4848-9E34-FA0DD74DFB53}">
+  <ds:schemaRefs>
+    <ds:schemaRef ds:uri="http://schemas.microsoft.com/office/2006/metadata/properties"/>
+    <ds:schemaRef ds:uri="http://schemas.microsoft.com/office/infopath/2007/PartnerControls"/>
+    <ds:schemaRef ds:uri="e65a9030-60ec-4a14-8955-2b18543e766f"/>
+    <ds:schemaRef ds:uri="http://schemas.microsoft.com/sharepoint/v3"/>
+    <ds:schemaRef ds:uri="de6b8331-2e8c-467d-b117-fec27c45c6dd"/>
+  </ds:schemaRefs>
+</ds:datastoreItem>
+</file>
+
+<file path=customXml/itemProps3.xml><?xml version="1.0" encoding="utf-8"?>
 <ds:datastoreItem xmlns:ds="http://schemas.openxmlformats.org/officeDocument/2006/customXml" ds:itemID="{9941D332-B04D-4151-9C9D-55B172D4138D}">
   <ds:schemaRefs>
     <ds:schemaRef ds:uri="http://schemas.microsoft.com/office/2006/metadata/contentType"/>
@@ -21202,22 +21214,10 @@
 </ds:datastoreItem>
 </file>
 
-<file path=customXml/itemProps3.xml><?xml version="1.0" encoding="utf-8"?>
-<ds:datastoreItem xmlns:ds="http://schemas.openxmlformats.org/officeDocument/2006/customXml" ds:itemID="{AD5BE390-E20C-4848-9E34-FA0DD74DFB53}">
+<file path=customXml/itemProps4.xml><?xml version="1.0" encoding="utf-8"?>
+<ds:datastoreItem xmlns:ds="http://schemas.openxmlformats.org/officeDocument/2006/customXml" ds:itemID="{2339508A-8A67-41CC-9A24-2CA767772708}">
   <ds:schemaRefs>
-    <ds:schemaRef ds:uri="http://schemas.microsoft.com/office/2006/metadata/properties"/>
-    <ds:schemaRef ds:uri="http://schemas.microsoft.com/office/infopath/2007/PartnerControls"/>
-    <ds:schemaRef ds:uri="e65a9030-60ec-4a14-8955-2b18543e766f"/>
-    <ds:schemaRef ds:uri="http://schemas.microsoft.com/sharepoint/v3"/>
-    <ds:schemaRef ds:uri="de6b8331-2e8c-467d-b117-fec27c45c6dd"/>
-  </ds:schemaRefs>
-</ds:datastoreItem>
-</file>
-
-<file path=customXml/itemProps4.xml><?xml version="1.0" encoding="utf-8"?>
-<ds:datastoreItem xmlns:ds="http://schemas.openxmlformats.org/officeDocument/2006/customXml" ds:itemID="{862140F3-E3E9-4737-B9D8-A6A75D17B8A0}">
-  <ds:schemaRefs>
-    <ds:schemaRef ds:uri="http://schemas.openxmlformats.org/officeDocument/2006/bibliography"/>
+    <ds:schemaRef ds:uri="http://schemas.microsoft.com/sharepoint/v3/contenttype/forms"/>
   </ds:schemaRefs>
 </ds:datastoreItem>
 </file>

</xml_diff>